<commit_message>
Fix isoflurane multiple-testing wording and add author/AI declaration to JATM manuscript
Co-Authored-By: Tatsuki Onishi <bougtoir@gmail.com>
</commit_message>
<xml_diff>
--- a/vaporizer-price-study/papers/jatm_manuscript_english.docx
+++ b/vaporizer-price-study/papers/jatm_manuscript_english.docx
@@ -21,11 +21,34 @@
       </w:pPr>
       <w:r>
         <w:rPr>
-          <w:b w:val="0"/>
-          <w:i/>
           <w:sz w:val="24"/>
         </w:rPr>
-        <w:t>[Author names to be inserted]</w:t>
+        <w:t>Onishi Tatsuki</w:t>
+      </w:r>
+      <w:r>
+        <w:rPr>
+          <w:sz w:val="24"/>
+          <w:vertAlign w:val="superscript"/>
+        </w:rPr>
+        <w:t>1</w:t>
+      </w:r>
+      <w:r>
+        <w:rPr>
+          <w:sz w:val="24"/>
+        </w:rPr>
+        <w:t>, Tatsuyoshi Ikenoue</w:t>
+      </w:r>
+      <w:r>
+        <w:rPr>
+          <w:sz w:val="24"/>
+          <w:vertAlign w:val="superscript"/>
+        </w:rPr>
+        <w:t>1,2</w:t>
+      </w:r>
+      <w:r>
+        <w:rPr>
+          <w:sz w:val="24"/>
+        </w:rPr>
       </w:r>
     </w:p>
     <w:p>
@@ -34,11 +57,44 @@
       </w:pPr>
       <w:r>
         <w:rPr>
-          <w:b w:val="0"/>
-          <w:i/>
           <w:sz w:val="24"/>
         </w:rPr>
-        <w:t>[Affiliations to be inserted]</w:t>
+      </w:r>
+      <w:r>
+        <w:rPr>
+          <w:sz w:val="24"/>
+          <w:vertAlign w:val="superscript"/>
+        </w:rPr>
+        <w:t>1</w:t>
+      </w:r>
+      <w:r>
+        <w:rPr>
+          <w:sz w:val="24"/>
+        </w:rPr>
+        <w:t>Data Science and AI Innovation Research Promotion Center, Shiga University</w:t>
+      </w:r>
+    </w:p>
+    <w:p>
+      <w:pPr>
+        <w:jc w:val="center"/>
+      </w:pPr>
+      <w:r>
+        <w:rPr>
+          <w:sz w:val="24"/>
+        </w:rPr>
+      </w:r>
+      <w:r>
+        <w:rPr>
+          <w:sz w:val="24"/>
+          <w:vertAlign w:val="superscript"/>
+        </w:rPr>
+        <w:t>2</w:t>
+      </w:r>
+      <w:r>
+        <w:rPr>
+          <w:sz w:val="24"/>
+        </w:rPr>
+        <w:t>Department of Public Health, Faculty of Medicine, University of Miyazaki</w:t>
       </w:r>
     </w:p>
     <w:p/>
@@ -57,7 +113,7 @@
           <w:i w:val="0"/>
           <w:sz w:val="24"/>
         </w:rPr>
-        <w:t>[Name, Department, Institution, Address, Country. Tel: [number]; e-mail: [address]]</w:t>
+        <w:t>Onishi Tatsuki; Data Science and AI Innovation Research Promotion Center, Shiga University; 1-1-1, Bamba, Hikone, Shiga, 522-8522, Japan; Telephone: +81-749-27-1023; E-mail: bougtoir@gmail.com</w:t>
       </w:r>
     </w:p>
     <w:p/>
@@ -187,7 +243,7 @@
           <w:i w:val="0"/>
           <w:sz w:val="24"/>
         </w:rPr>
-        <w:t>1033 completed sales were analyzed (158 desflurane, 321 sevoflurane, 554 isoflurane). Desflurane vaporizer prices declined (Spearman ρ=-0.28, P&lt;0.001; Kendall τ=-0.12, P=0.049), with a 31% decline pre- to post-restriction (Cohen’s d=-0.47). Sevoflurane showed no consistent trend. Isoflurane reached nominal significance (ρ=-0.09, P=0.044), but the small correlation was not supported by other trend metrics; with multiple trend tests, an isolated P value near 0.05 is expected by chance.</w:t>
+        <w:t>1033 completed sales were analyzed (158 desflurane, 321 sevoflurane, 554 isoflurane). Desflurane vaporizer prices declined (Spearman ρ=-0.28, P&lt;0.001; Kendall τ=-0.12, P=0.049), with a 31% decline pre- to post-restriction (Cohen’s d=-0.47). Sevoflurane showed no trend. Isoflurane reached nominal significance in Spearman (ρ=-0.09, P=0.044) and Kendall τ (τ=-0.07, P=0.025) tests, but the quarterly median trend was not significant; these isolated P values, with small effect sizes, are interpreted cautiously.</w:t>
       </w:r>
     </w:p>
     <w:p>
@@ -547,7 +603,7 @@
     </w:p>
     <w:p>
       <w:r>
-        <w:t>Because trend tests (Spearman, Kendall τ, and quarterly Spearman) were applied to each of three agent types, the probability of at least one nominally significant P value arising under the null is inflated. We did not apply a formal family-wise multiple-testing correction; instead, P values were interpreted alongside effect magnitude, direction, and consistency across tests. An isolated P value near 0.05 (e.g., isoflurane Spearman P=0.044) was therefore not considered evidence of a true trend.</w:t>
+        <w:t>Because trend tests (Spearman, Kendall τ, and quarterly Spearman) were applied to each of three agent types, the probability of nominally significant P values arising under the null is inflated. We did not apply a formal family-wise multiple-testing correction; instead, P values were interpreted alongside effect magnitude, direction, and consistency across tests. For isoflurane, both Spearman (P=0.044) and Kendall τ (P=0.025) tests reached nominal significance at the transaction level, but the quarterly median trend was not significant and effects were small; these P values were therefore interpreted cautiously and not considered evidence of a true trend.</w:t>
       </w:r>
     </w:p>
     <w:p>
@@ -1156,7 +1212,7 @@
           <w:i/>
           <w:sz w:val="18"/>
         </w:rPr>
-        <w:t>The Spearman correlation for isoflurane reached nominal significance (P=0.044), but the magnitude was small (ρ=0.081) and the quarterly median trend was not significant; this is therefore not interpreted as a clinically meaningful temporal trend.</w:t>
+        <w:t>The Spearman and Kendall τ tests for isoflurane reached nominal significance (P=0.044 and P=0.025, respectively), but effect sizes were small and the quarterly median trend was not significant; this is therefore not interpreted as a clinically meaningful temporal trend.</w:t>
       </w:r>
     </w:p>
     <w:p/>
@@ -2350,7 +2406,7 @@
     <w:p/>
     <w:p>
       <w:r>
-        <w:t>Isoflurane vaporizer prices were similarly stable. Although Spearman correlation reached nominal significance (ρ=-0.09, P=0.044), the magnitude was very small and the quarterly median trend was not significant (ρ=-0.32, P=0.285). A single P value below 0.05 in one of several trend tests is expected under multiple testing and does not indicate a consistent directional trend. The pre-/post-ban comparison showed a non-significant 11% decline (P=0.184, Mann–Whitney U) (Fig. 6).</w:t>
+        <w:t>Isoflurane vaporizer prices were similarly stable. Spearman (ρ=-0.09, P=0.044) and Kendall τ (τ=-0.07, P=0.025) tests reached nominal significance at the transaction level, but the quarterly median trend was not significant (ρ=-0.32, P=0.285) and effect sizes were small. These isolated P values are expected under multiple testing and do not indicate a consistent directional trend. The pre-/post-ban comparison showed a non-significant 11% decline (P=0.184, Mann–Whitney U) (Fig. 6).</w:t>
       </w:r>
     </w:p>
     <w:p/>
@@ -2451,7 +2507,7 @@
     </w:p>
     <w:p>
       <w:r>
-        <w:t>We did not family-wise correct trend tests across three agents; an isolated P value near 0.05 (e.g., isoflurane Spearman P=0.044) is expected by chance. The desflurane finding is supported by consistency across Spearman, Kendall τ, and quarterly median analyses.</w:t>
+        <w:t>We did not family-wise correct trend tests across three agents. For isoflurane, Spearman (P=0.044) and Kendall τ (P=0.025) tests were nominally significant at the transaction level, but the quarterly median trend was not significant and effect sizes were small; these isolated P values are expected by chance and are not interpreted as a true trend. The desflurane finding is supported by consistency across Spearman, Kendall τ, and quarterly median analyses.</w:t>
       </w:r>
     </w:p>
     <w:p>
@@ -2614,7 +2670,12 @@
     </w:p>
     <w:p>
       <w:r>
-        <w:t>[To be completed by authors using CRediT taxonomy]</w:t>
+        <w:t>O.T.: Conceptualization, Methodology, Software, Formal analysis, Writing - original draft, Writing - review &amp; editing</w:t>
+      </w:r>
+    </w:p>
+    <w:p>
+      <w:r>
+        <w:t>T.I.: Writing - original draft, Writing - review &amp; editing</w:t>
       </w:r>
     </w:p>
     <w:p>
@@ -2711,6 +2772,22 @@
     <w:p>
       <w:r>
         <w:t>None.</w:t>
+      </w:r>
+    </w:p>
+    <w:p>
+      <w:pPr>
+        <w:pStyle w:val="Heading1"/>
+      </w:pPr>
+      <w:r>
+        <w:rPr>
+          <w:color w:val="000000"/>
+        </w:rPr>
+        <w:t>Declaration of Generative Artificial Intelligence (AI) in Scientific Writing</w:t>
+      </w:r>
+    </w:p>
+    <w:p>
+      <w:r>
+        <w:t>During the preparation of this work the author used Devin (devin.ai) in order to format the text and choose words that suited the tone, and to help writing codes. After using this tool/service, the author reviewed and edited the content as needed and takes full responsibility for the content of the published article.</w:t>
       </w:r>
     </w:p>
     <w:p>

</xml_diff>

<commit_message>
Sync JATM R1 Devin Review fixes: reference order, response letter fallbacks, PPTX/STROBE title, and verify citation check
Co-Authored-By: Tatsuki Onishi <bougtoir@gmail.com>
</commit_message>
<xml_diff>
--- a/vaporizer-price-study/papers/jatm_manuscript_english.docx
+++ b/vaporizer-price-study/papers/jatm_manuscript_english.docx
@@ -292,7 +292,7 @@
           <w:sz w:val="24"/>
           <w:vertAlign w:val="superscript"/>
         </w:rPr>
-        <w:t>1,2,5–7</w:t>
+        <w:t>1,2,3–5</w:t>
       </w:r>
       <w:r>
         <w:rPr>
@@ -318,7 +318,7 @@
           <w:sz w:val="24"/>
           <w:vertAlign w:val="superscript"/>
         </w:rPr>
-        <w:t>3</w:t>
+        <w:t>6</w:t>
       </w:r>
       <w:r>
         <w:rPr>
@@ -331,7 +331,7 @@
           <w:sz w:val="24"/>
           <w:vertAlign w:val="superscript"/>
         </w:rPr>
-        <w:t>4</w:t>
+        <w:t>7</w:t>
       </w:r>
       <w:r>
         <w:rPr>
@@ -2597,7 +2597,7 @@
           <w:sz w:val="24"/>
           <w:vertAlign w:val="superscript"/>
         </w:rPr>
-        <w:t>3,4,22</w:t>
+        <w:t>6,7,22</w:t>
       </w:r>
       <w:r>
         <w:rPr>
@@ -2857,7 +2857,7 @@
         <w:rPr>
           <w:sz w:val="20"/>
         </w:rPr>
-        <w:t>Sulbaek Andersen MP, Nielsen OJ, Sherman JD. Assessing the potential climate impact of anaesthetic gases. Lancet Planet Health. 2023;7(7):e622–e629. doi:10.1016/S2542-5196(23)00084-0.</w:t>
+        <w:t>Sherman J, Le C, Lamers V, et al. Life cycle greenhouse gas emissions of anesthetic drugs. Anesth Analg. 2012;114:1086–90.</w:t>
       </w:r>
     </w:p>
     <w:p>
@@ -2875,7 +2875,7 @@
         <w:rPr>
           <w:sz w:val="20"/>
         </w:rPr>
-        <w:t>Hariyanto H, Widiastuti M, Pandrya CO, et al. Comparison of desflurane and sevoflurane as maintenance inhalational anaesthetic agents for adult patients undergoing neurosurgeries: a systematic review and meta-analysis of randomised trials. Indian J Anaesth. 2025;69(1):65–77. doi:10.4103/ija.ija_1215_24.</w:t>
+        <w:t>Hendrickx JFA, Nielsen OJ, De Hert S, et al. The science behind banning desflurane: a narrative review. Eur J Anaesthesiol. 2022;39:818–24.</w:t>
       </w:r>
     </w:p>
     <w:p>
@@ -2893,7 +2893,7 @@
         <w:rPr>
           <w:sz w:val="20"/>
         </w:rPr>
-        <w:t>Sherman J, Le C, Lamers V, et al. Life cycle greenhouse gas emissions of anesthetic drugs. Anesth Analg. 2012;114:1086–90.</w:t>
+        <w:t>White SM, Shelton CL, Gelb AW, et al. Principles of environmentally-sustainable anaesthesia: a global consensus statement from the World Federation of Societies of Anaesthesiologists. Anaesthesia. 2022;77:201–12.</w:t>
       </w:r>
     </w:p>
     <w:p>
@@ -2911,7 +2911,7 @@
         <w:rPr>
           <w:sz w:val="20"/>
         </w:rPr>
-        <w:t>Hendrickx JFA, Nielsen OJ, De Hert S, et al. The science behind banning desflurane: a narrative review. Eur J Anaesthesiol. 2022;39:818–24.</w:t>
+        <w:t>Sulbaek Andersen MP, Nielsen OJ, Sherman JD. Assessing the potential climate impact of anaesthetic gases. Lancet Planet Health. 2023;7(7):e622–e629. doi:10.1016/S2542-5196(23)00084-0.</w:t>
       </w:r>
     </w:p>
     <w:p>
@@ -2929,7 +2929,7 @@
         <w:rPr>
           <w:sz w:val="20"/>
         </w:rPr>
-        <w:t>White SM, Shelton CL, Gelb AW, et al. Principles of environmentally-sustainable anaesthesia: a global consensus statement from the World Federation of Societies of Anaesthesiologists. Anaesthesia. 2022;77:201–12.</w:t>
+        <w:t>Hariyanto H, Widiastuti M, Pandrya CO, et al. Comparison of desflurane and sevoflurane as maintenance inhalational anaesthetic agents for adult patients undergoing neurosurgeries: a systematic review and meta-analysis of randomised trials. Indian J Anaesth. 2025;69(1):65–77. doi:10.4103/ija.ija_1215_24.</w:t>
       </w:r>
     </w:p>
     <w:p>

</xml_diff>